<commit_message>
Update: Clinical realism overhaul — fix truncation, expand 19 diagnoses, add validation
- Fix Section 7 truncation bug where string slicing cut fields to ~6 chars
- Consolidate duplicate JSON parsing into shared robust_parse_json()
- Add pre-export field-length validation (overflow + suspiciously short)
- Expand diagnosis presets from 6 to 19 with accurate vitals & PE findings
- Improve generation progress indicators with per-phase status messages

Co-Authored-By: Claude Opus 4.6 <noreply@anthropic.com>
</commit_message>
<xml_diff>
--- a/Simulation Case Template_2025.docx
+++ b/Simulation Case Template_2025.docx
@@ -7091,7 +7091,9 @@
                 <w:rFonts w:cs="Calibri"/>
               </w:rPr>
               <w:tab/>
-              <w:t>&lt;0.06 ng/L</w:t>
+            </w:r>
+            <w:r>
+              <w:t>{{troponin}}</w:t>
             </w:r>
           </w:p>
           <w:p>
@@ -7128,56 +7130,8 @@
               <w:rPr>
                 <w:rFonts w:cs="Calibri"/>
               </w:rPr>
-              <w:t>TSH</w:t>
-            </w:r>
-            <w:r>
-              <w:rPr>
-                <w:rFonts w:cs="Calibri"/>
-              </w:rPr>
-              <w:tab/>
-            </w:r>
-            <w:r>
-              <w:rPr>
-                <w:rFonts w:cs="Calibri"/>
-              </w:rPr>
-              <w:tab/>
-              <w:t>mU/L</w:t>
-            </w:r>
-          </w:p>
-          <w:p>
-            <w:pPr>
-              <w:ind w:left="720" w:hanging="720"/>
-              <w:rPr>
-                <w:rFonts w:cs="Calibri"/>
-              </w:rPr>
-            </w:pPr>
-            <w:r>
-              <w:rPr>
-                <w:rFonts w:cs="Calibri"/>
-              </w:rPr>
-              <w:t>T4</w:t>
-            </w:r>
-            <w:r>
-              <w:rPr>
-                <w:rFonts w:cs="Calibri"/>
-              </w:rPr>
-              <w:tab/>
-            </w:r>
-            <w:r>
-              <w:rPr>
-                <w:rFonts w:cs="Calibri"/>
-              </w:rPr>
-              <w:tab/>
-              <w:t>ng/dL</w:t>
-            </w:r>
-          </w:p>
-          <w:p>
-            <w:pPr>
-              <w:ind w:left="720" w:hanging="720"/>
-              <w:rPr>
-                <w:rFonts w:cs="Calibri"/>
-              </w:rPr>
-            </w:pPr>
+              <w:t>TSH: {{tsh}} mU/L</w:t>
+            </w:r>
           </w:p>
           <w:p>
             <w:pPr>
@@ -7255,7 +7209,6 @@
               <w:rPr>
                 <w:rFonts w:cs="Calibri"/>
               </w:rPr>
-              <w:lastRenderedPageBreak/>
               <w:t>Spec Grav</w:t>
             </w:r>
             <w:r>
@@ -7263,7 +7216,9 @@
                 <w:rFonts w:cs="Calibri"/>
               </w:rPr>
               <w:tab/>
-              <w:t>1.015</w:t>
+            </w:r>
+            <w:r>
+              <w:t>{{ua_spec_grav}}</w:t>
             </w:r>
           </w:p>
           <w:p>
@@ -7296,7 +7251,80 @@
               <w:rPr>
                 <w:rFonts w:cs="Calibri"/>
               </w:rPr>
+              <w:lastRenderedPageBreak/>
               <w:t>Protein</w:t>
+            </w:r>
+            <w:r>
+              <w:rPr>
+                <w:rFonts w:cs="Calibri"/>
+              </w:rPr>
+              <w:tab/>
+            </w:r>
+            <w:r>
+              <w:rPr>
+                <w:rFonts w:cs="Calibri"/>
+              </w:rPr>
+              <w:tab/>
+            </w:r>
+            <w:r>
+              <w:t>{{ua_protein}}</w:t>
+            </w:r>
+          </w:p>
+          <w:p>
+            <w:pPr>
+              <w:rPr>
+                <w:rFonts w:cs="Calibri"/>
+              </w:rPr>
+            </w:pPr>
+            <w:r>
+              <w:rPr>
+                <w:rFonts w:cs="Calibri"/>
+              </w:rPr>
+              <w:t>Ketones</w:t>
+            </w:r>
+            <w:r>
+              <w:rPr>
+                <w:rFonts w:cs="Calibri"/>
+              </w:rPr>
+              <w:tab/>
+            </w:r>
+            <w:r>
+              <w:t>{{ua_ketones}}</w:t>
+            </w:r>
+          </w:p>
+          <w:p>
+            <w:pPr>
+              <w:rPr>
+                <w:rFonts w:cs="Calibri"/>
+              </w:rPr>
+            </w:pPr>
+            <w:r>
+              <w:rPr>
+                <w:rFonts w:cs="Calibri"/>
+              </w:rPr>
+              <w:t>Glucose</w:t>
+            </w:r>
+            <w:r>
+              <w:rPr>
+                <w:rFonts w:cs="Calibri"/>
+              </w:rPr>
+              <w:tab/>
+            </w:r>
+            <w:r>
+              <w:t>{{ua_glucose}}</w:t>
+            </w:r>
+          </w:p>
+          <w:p>
+            <w:pPr>
+              <w:rPr>
+                <w:rFonts w:cs="Calibri"/>
+              </w:rPr>
+            </w:pPr>
+            <w:r>
+              <w:rPr>
+                <w:rFonts w:cs="Calibri"/>
+              </w:rPr>
+              <w:t>Blood</w:t>
             </w:r>
             <w:r>
               <w:rPr>
@@ -7322,7 +7350,13 @@
               <w:rPr>
                 <w:rFonts w:cs="Calibri"/>
               </w:rPr>
-              <w:t>Ketones</w:t>
+              <w:t>Bili</w:t>
+            </w:r>
+            <w:r>
+              <w:rPr>
+                <w:rFonts w:cs="Calibri"/>
+              </w:rPr>
+              <w:tab/>
             </w:r>
             <w:r>
               <w:rPr>
@@ -7342,7 +7376,13 @@
               <w:rPr>
                 <w:rFonts w:cs="Calibri"/>
               </w:rPr>
-              <w:t>Glucose</w:t>
+              <w:t>Leuks</w:t>
+            </w:r>
+            <w:r>
+              <w:rPr>
+                <w:rFonts w:cs="Calibri"/>
+              </w:rPr>
+              <w:tab/>
             </w:r>
             <w:r>
               <w:rPr>
@@ -7362,7 +7402,7 @@
               <w:rPr>
                 <w:rFonts w:cs="Calibri"/>
               </w:rPr>
-              <w:t>Blood</w:t>
+              <w:t>Nitrite</w:t>
             </w:r>
             <w:r>
               <w:rPr>
@@ -7388,13 +7428,7 @@
               <w:rPr>
                 <w:rFonts w:cs="Calibri"/>
               </w:rPr>
-              <w:t>Bili</w:t>
-            </w:r>
-            <w:r>
-              <w:rPr>
-                <w:rFonts w:cs="Calibri"/>
-              </w:rPr>
-              <w:tab/>
+              <w:t>Bacteria</w:t>
             </w:r>
             <w:r>
               <w:rPr>
@@ -7408,13 +7442,35 @@
             <w:pPr>
               <w:rPr>
                 <w:rFonts w:cs="Calibri"/>
-              </w:rPr>
-            </w:pPr>
-            <w:r>
-              <w:rPr>
-                <w:rFonts w:cs="Calibri"/>
-              </w:rPr>
-              <w:t>Leuks</w:t>
+                <w:u w:val="single"/>
+              </w:rPr>
+            </w:pPr>
+          </w:p>
+          <w:p>
+            <w:pPr>
+              <w:rPr>
+                <w:rFonts w:cs="Calibri"/>
+              </w:rPr>
+            </w:pPr>
+            <w:r>
+              <w:rPr>
+                <w:rFonts w:cs="Calibri"/>
+                <w:u w:val="single"/>
+              </w:rPr>
+              <w:t>Tox</w:t>
+            </w:r>
+          </w:p>
+          <w:p>
+            <w:pPr>
+              <w:rPr>
+                <w:rFonts w:cs="Calibri"/>
+              </w:rPr>
+            </w:pPr>
+            <w:r>
+              <w:rPr>
+                <w:rFonts w:cs="Calibri"/>
+              </w:rPr>
+              <w:t>EtOH</w:t>
             </w:r>
             <w:r>
               <w:rPr>
@@ -7427,20 +7483,22 @@
                 <w:rFonts w:cs="Calibri"/>
               </w:rPr>
               <w:tab/>
-              <w:t>Neg</w:t>
-            </w:r>
-          </w:p>
-          <w:p>
-            <w:pPr>
-              <w:rPr>
-                <w:rFonts w:cs="Calibri"/>
-              </w:rPr>
-            </w:pPr>
-            <w:r>
-              <w:rPr>
-                <w:rFonts w:cs="Calibri"/>
-              </w:rPr>
-              <w:t>Nitrite</w:t>
+            </w:r>
+            <w:r>
+              <w:t>{{etoh}}</w:t>
+            </w:r>
+          </w:p>
+          <w:p>
+            <w:pPr>
+              <w:rPr>
+                <w:rFonts w:cs="Calibri"/>
+              </w:rPr>
+            </w:pPr>
+            <w:r>
+              <w:rPr>
+                <w:rFonts w:cs="Calibri"/>
+              </w:rPr>
+              <w:t>APAP</w:t>
             </w:r>
             <w:r>
               <w:rPr>
@@ -7453,27 +7511,37 @@
                 <w:rFonts w:cs="Calibri"/>
               </w:rPr>
               <w:tab/>
-              <w:t>Neg</w:t>
-            </w:r>
-          </w:p>
-          <w:p>
-            <w:pPr>
-              <w:rPr>
-                <w:rFonts w:cs="Calibri"/>
-              </w:rPr>
-            </w:pPr>
-            <w:r>
-              <w:rPr>
-                <w:rFonts w:cs="Calibri"/>
-              </w:rPr>
-              <w:t>Bacteria</w:t>
+            </w:r>
+            <w:r>
+              <w:t>{{apap}}</w:t>
+            </w:r>
+          </w:p>
+          <w:p>
+            <w:pPr>
+              <w:rPr>
+                <w:rFonts w:cs="Calibri"/>
+              </w:rPr>
+            </w:pPr>
+            <w:r>
+              <w:rPr>
+                <w:rFonts w:cs="Calibri"/>
+              </w:rPr>
+              <w:t>ASA</w:t>
             </w:r>
             <w:r>
               <w:rPr>
                 <w:rFonts w:cs="Calibri"/>
               </w:rPr>
               <w:tab/>
-              <w:t>Neg</w:t>
+            </w:r>
+            <w:r>
+              <w:rPr>
+                <w:rFonts w:cs="Calibri"/>
+              </w:rPr>
+              <w:tab/>
+            </w:r>
+            <w:r>
+              <w:t>{{asa}}</w:t>
             </w:r>
           </w:p>
           <w:p>
@@ -7495,20 +7563,20 @@
                 <w:rFonts w:cs="Calibri"/>
                 <w:u w:val="single"/>
               </w:rPr>
-              <w:t>Tox</w:t>
-            </w:r>
-          </w:p>
-          <w:p>
-            <w:pPr>
-              <w:rPr>
-                <w:rFonts w:cs="Calibri"/>
-              </w:rPr>
-            </w:pPr>
-            <w:r>
-              <w:rPr>
-                <w:rFonts w:cs="Calibri"/>
-              </w:rPr>
-              <w:t>EtOH</w:t>
+              <w:t>UDS</w:t>
+            </w:r>
+          </w:p>
+          <w:p>
+            <w:pPr>
+              <w:rPr>
+                <w:rFonts w:cs="Calibri"/>
+              </w:rPr>
+            </w:pPr>
+            <w:r>
+              <w:rPr>
+                <w:rFonts w:cs="Calibri"/>
+              </w:rPr>
+              <w:t>Amph</w:t>
             </w:r>
             <w:r>
               <w:rPr>
@@ -7521,20 +7589,22 @@
                 <w:rFonts w:cs="Calibri"/>
               </w:rPr>
               <w:tab/>
-              <w:t>&lt;2</w:t>
-            </w:r>
-          </w:p>
-          <w:p>
-            <w:pPr>
-              <w:rPr>
-                <w:rFonts w:cs="Calibri"/>
-              </w:rPr>
-            </w:pPr>
-            <w:r>
-              <w:rPr>
-                <w:rFonts w:cs="Calibri"/>
-              </w:rPr>
-              <w:t>APAP</w:t>
+            </w:r>
+            <w:r>
+              <w:t>{{uds_findings}}</w:t>
+            </w:r>
+          </w:p>
+          <w:p>
+            <w:pPr>
+              <w:rPr>
+                <w:rFonts w:cs="Calibri"/>
+              </w:rPr>
+            </w:pPr>
+            <w:r>
+              <w:rPr>
+                <w:rFonts w:cs="Calibri"/>
+              </w:rPr>
+              <w:t>Benzo</w:t>
             </w:r>
             <w:r>
               <w:rPr>
@@ -7547,20 +7617,22 @@
                 <w:rFonts w:cs="Calibri"/>
               </w:rPr>
               <w:tab/>
-              <w:t>&lt;0.15</w:t>
-            </w:r>
-          </w:p>
-          <w:p>
-            <w:pPr>
-              <w:rPr>
-                <w:rFonts w:cs="Calibri"/>
-              </w:rPr>
-            </w:pPr>
-            <w:r>
-              <w:rPr>
-                <w:rFonts w:cs="Calibri"/>
-              </w:rPr>
-              <w:t>ASA</w:t>
+            </w:r>
+            <w:r>
+              <w:t>{{uds_findings}}</w:t>
+            </w:r>
+          </w:p>
+          <w:p>
+            <w:pPr>
+              <w:rPr>
+                <w:rFonts w:cs="Calibri"/>
+              </w:rPr>
+            </w:pPr>
+            <w:r>
+              <w:rPr>
+                <w:rFonts w:cs="Calibri"/>
+              </w:rPr>
+              <w:t>Cocaine</w:t>
             </w:r>
             <w:r>
               <w:rPr>
@@ -7569,46 +7641,42 @@
               <w:tab/>
             </w:r>
             <w:r>
+              <w:t>{{uds_findings}}</w:t>
+            </w:r>
+          </w:p>
+          <w:p>
+            <w:pPr>
+              <w:rPr>
+                <w:rFonts w:cs="Calibri"/>
+              </w:rPr>
+            </w:pPr>
+            <w:r>
+              <w:rPr>
+                <w:rFonts w:cs="Calibri"/>
+              </w:rPr>
+              <w:t>Opiates</w:t>
+            </w:r>
+            <w:r>
               <w:rPr>
                 <w:rFonts w:cs="Calibri"/>
               </w:rPr>
               <w:tab/>
-              <w:t>&lt;0.36</w:t>
-            </w:r>
-          </w:p>
-          <w:p>
-            <w:pPr>
-              <w:rPr>
-                <w:rFonts w:cs="Calibri"/>
-                <w:u w:val="single"/>
-              </w:rPr>
-            </w:pPr>
-          </w:p>
-          <w:p>
-            <w:pPr>
-              <w:rPr>
-                <w:rFonts w:cs="Calibri"/>
-              </w:rPr>
-            </w:pPr>
-            <w:r>
-              <w:rPr>
-                <w:rFonts w:cs="Calibri"/>
-                <w:u w:val="single"/>
-              </w:rPr>
-              <w:t>UDS</w:t>
-            </w:r>
-          </w:p>
-          <w:p>
-            <w:pPr>
-              <w:rPr>
-                <w:rFonts w:cs="Calibri"/>
-              </w:rPr>
-            </w:pPr>
-            <w:r>
-              <w:rPr>
-                <w:rFonts w:cs="Calibri"/>
-              </w:rPr>
-              <w:t>Amph</w:t>
+            </w:r>
+            <w:r>
+              <w:t>{{uds_findings}}</w:t>
+            </w:r>
+          </w:p>
+          <w:p>
+            <w:pPr>
+              <w:rPr>
+                <w:rFonts w:cs="Calibri"/>
+              </w:rPr>
+            </w:pPr>
+            <w:r>
+              <w:rPr>
+                <w:rFonts w:cs="Calibri"/>
+              </w:rPr>
+              <w:t>THC</w:t>
             </w:r>
             <w:r>
               <w:rPr>
@@ -7621,99 +7689,9 @@
                 <w:rFonts w:cs="Calibri"/>
               </w:rPr>
               <w:tab/>
-              <w:t>+/-</w:t>
-            </w:r>
-          </w:p>
-          <w:p>
-            <w:pPr>
-              <w:rPr>
-                <w:rFonts w:cs="Calibri"/>
-              </w:rPr>
-            </w:pPr>
-            <w:r>
-              <w:rPr>
-                <w:rFonts w:cs="Calibri"/>
-              </w:rPr>
-              <w:t>Benzo</w:t>
-            </w:r>
-            <w:r>
-              <w:rPr>
-                <w:rFonts w:cs="Calibri"/>
-              </w:rPr>
-              <w:tab/>
-            </w:r>
-            <w:r>
-              <w:rPr>
-                <w:rFonts w:cs="Calibri"/>
-              </w:rPr>
-              <w:tab/>
-              <w:t>+/-</w:t>
-            </w:r>
-          </w:p>
-          <w:p>
-            <w:pPr>
-              <w:rPr>
-                <w:rFonts w:cs="Calibri"/>
-              </w:rPr>
-            </w:pPr>
-            <w:r>
-              <w:rPr>
-                <w:rFonts w:cs="Calibri"/>
-              </w:rPr>
-              <w:t>Cocaine</w:t>
-            </w:r>
-            <w:r>
-              <w:rPr>
-                <w:rFonts w:cs="Calibri"/>
-              </w:rPr>
-              <w:tab/>
-              <w:t>+/-</w:t>
-            </w:r>
-          </w:p>
-          <w:p>
-            <w:pPr>
-              <w:rPr>
-                <w:rFonts w:cs="Calibri"/>
-              </w:rPr>
-            </w:pPr>
-            <w:r>
-              <w:rPr>
-                <w:rFonts w:cs="Calibri"/>
-              </w:rPr>
-              <w:t>Opiates</w:t>
-            </w:r>
-            <w:r>
-              <w:rPr>
-                <w:rFonts w:cs="Calibri"/>
-              </w:rPr>
-              <w:tab/>
-              <w:t>+/-</w:t>
-            </w:r>
-          </w:p>
-          <w:p>
-            <w:pPr>
-              <w:rPr>
-                <w:rFonts w:cs="Calibri"/>
-              </w:rPr>
-            </w:pPr>
-            <w:r>
-              <w:rPr>
-                <w:rFonts w:cs="Calibri"/>
-              </w:rPr>
-              <w:t>THC</w:t>
-            </w:r>
-            <w:r>
-              <w:rPr>
-                <w:rFonts w:cs="Calibri"/>
-              </w:rPr>
-              <w:tab/>
-            </w:r>
-            <w:r>
-              <w:rPr>
-                <w:rFonts w:cs="Calibri"/>
-              </w:rPr>
-              <w:tab/>
-              <w:t>+/-</w:t>
+            </w:r>
+            <w:r>
+              <w:t>{{uds_findings}}</w:t>
             </w:r>
           </w:p>
         </w:tc>
@@ -7815,44 +7793,24 @@
         </w:tc>
       </w:tr>
       <w:tr>
-        <w:customXmlInsRangeStart w:id="1" w:author="Bryan Arthur Klein" w:date="2025-07-30T10:22:00Z"/>
-        <w:sdt>
-          <w:sdtPr>
-            <w:rPr>
-              <w:rFonts w:cs="Calibri"/>
-            </w:rPr>
-            <w:id w:val="1700357173"/>
-            <w14:checkbox>
-              <w14:checked w14:val="0"/>
-              <w14:checkedState w14:val="2612" w14:font="MS Gothic"/>
-              <w14:uncheckedState w14:val="2610" w14:font="MS Gothic"/>
-            </w14:checkbox>
-          </w:sdtPr>
-          <w:sdtContent>
-            <w:customXmlInsRangeEnd w:id="1"/>
-            <w:tc>
-              <w:tcPr>
-                <w:tcW w:w="10790" w:type="dxa"/>
-              </w:tcPr>
-              <w:p>
-                <w:pPr>
-                  <w:pStyle w:val="ListParagraph"/>
-                  <w:rPr>
-                    <w:rFonts w:cs="Calibri"/>
-                  </w:rPr>
-                </w:pPr>
-                <w:r>
-                  <w:rPr>
-                    <w:rFonts w:ascii="MS Gothic" w:eastAsia="MS Gothic" w:hAnsi="MS Gothic" w:cs="Calibri" w:hint="eastAsia"/>
-                  </w:rPr>
-                  <w:t>☐</w:t>
-                </w:r>
-              </w:p>
-            </w:tc>
-            <w:customXmlInsRangeStart w:id="2" w:author="Bryan Arthur Klein" w:date="2025-07-30T10:22:00Z"/>
-          </w:sdtContent>
-        </w:sdt>
-        <w:customXmlInsRangeEnd w:id="2"/>
+        <w:trPr>
+          <w:trHeight w:val="782"/>
+        </w:trPr>
+        <w:tc>
+          <w:tcPr>
+            <w:tcW w:w="10790" w:type="dxa"/>
+          </w:tcPr>
+          <w:p>
+            <w:pPr>
+              <w:rPr>
+                <w:rFonts w:cs="Calibri"/>
+              </w:rPr>
+            </w:pPr>
+            <w:r>
+              <w:t>{{critical_actions}}</w:t>
+            </w:r>
+          </w:p>
+        </w:tc>
       </w:tr>
     </w:tbl>
     <w:p>
@@ -7906,15 +7864,13 @@
           </w:tcPr>
           <w:p>
             <w:pPr>
-              <w:pStyle w:val="ListParagraph"/>
-              <w:numPr>
-                <w:ilvl w:val="0"/>
-                <w:numId w:val="2"/>
-              </w:numPr>
-              <w:rPr>
-                <w:rFonts w:cs="Calibri"/>
-              </w:rPr>
-            </w:pPr>
+              <w:rPr>
+                <w:rFonts w:cs="Calibri"/>
+              </w:rPr>
+            </w:pPr>
+            <w:r>
+              <w:t>{{debrief_questions}}</w:t>
+            </w:r>
           </w:p>
         </w:tc>
       </w:tr>
@@ -7970,15 +7926,13 @@
           </w:tcPr>
           <w:p>
             <w:pPr>
-              <w:pStyle w:val="ListParagraph"/>
-              <w:numPr>
-                <w:ilvl w:val="0"/>
-                <w:numId w:val="8"/>
-              </w:numPr>
-              <w:rPr>
-                <w:rFonts w:cs="Calibri"/>
-              </w:rPr>
-            </w:pPr>
+              <w:rPr>
+                <w:rFonts w:cs="Calibri"/>
+              </w:rPr>
+            </w:pPr>
+            <w:r>
+              <w:t>{{references}}</w:t>
+            </w:r>
           </w:p>
         </w:tc>
       </w:tr>
@@ -8705,6 +8659,95 @@
     </w:lvl>
   </w:abstractNum>
   <w:abstractNum w:abstractNumId="1" w15:restartNumberingAfterBreak="0">
+    <w:nsid w:val="12F1526D"/>
+    <w:multiLevelType w:val="hybridMultilevel"/>
+    <w:tmpl w:val="804ECE60"/>
+    <w:lvl w:ilvl="0" w:tplc="0409000F">
+      <w:start w:val="1"/>
+      <w:numFmt w:val="decimal"/>
+      <w:lvlText w:val="%1."/>
+      <w:lvlJc w:val="left"/>
+      <w:pPr>
+        <w:ind w:left="720" w:hanging="360"/>
+      </w:pPr>
+      <w:rPr>
+        <w:rFonts w:hint="default"/>
+      </w:rPr>
+    </w:lvl>
+    <w:lvl w:ilvl="1" w:tplc="04090019" w:tentative="1">
+      <w:start w:val="1"/>
+      <w:numFmt w:val="lowerLetter"/>
+      <w:lvlText w:val="%2."/>
+      <w:lvlJc w:val="left"/>
+      <w:pPr>
+        <w:ind w:left="1440" w:hanging="360"/>
+      </w:pPr>
+    </w:lvl>
+    <w:lvl w:ilvl="2" w:tplc="0409001B" w:tentative="1">
+      <w:start w:val="1"/>
+      <w:numFmt w:val="lowerRoman"/>
+      <w:lvlText w:val="%3."/>
+      <w:lvlJc w:val="right"/>
+      <w:pPr>
+        <w:ind w:left="2160" w:hanging="180"/>
+      </w:pPr>
+    </w:lvl>
+    <w:lvl w:ilvl="3" w:tplc="0409000F" w:tentative="1">
+      <w:start w:val="1"/>
+      <w:numFmt w:val="decimal"/>
+      <w:lvlText w:val="%4."/>
+      <w:lvlJc w:val="left"/>
+      <w:pPr>
+        <w:ind w:left="2880" w:hanging="360"/>
+      </w:pPr>
+    </w:lvl>
+    <w:lvl w:ilvl="4" w:tplc="04090019" w:tentative="1">
+      <w:start w:val="1"/>
+      <w:numFmt w:val="lowerLetter"/>
+      <w:lvlText w:val="%5."/>
+      <w:lvlJc w:val="left"/>
+      <w:pPr>
+        <w:ind w:left="3600" w:hanging="360"/>
+      </w:pPr>
+    </w:lvl>
+    <w:lvl w:ilvl="5" w:tplc="0409001B" w:tentative="1">
+      <w:start w:val="1"/>
+      <w:numFmt w:val="lowerRoman"/>
+      <w:lvlText w:val="%6."/>
+      <w:lvlJc w:val="right"/>
+      <w:pPr>
+        <w:ind w:left="4320" w:hanging="180"/>
+      </w:pPr>
+    </w:lvl>
+    <w:lvl w:ilvl="6" w:tplc="0409000F" w:tentative="1">
+      <w:start w:val="1"/>
+      <w:numFmt w:val="decimal"/>
+      <w:lvlText w:val="%7."/>
+      <w:lvlJc w:val="left"/>
+      <w:pPr>
+        <w:ind w:left="5040" w:hanging="360"/>
+      </w:pPr>
+    </w:lvl>
+    <w:lvl w:ilvl="7" w:tplc="04090019" w:tentative="1">
+      <w:start w:val="1"/>
+      <w:numFmt w:val="lowerLetter"/>
+      <w:lvlText w:val="%8."/>
+      <w:lvlJc w:val="left"/>
+      <w:pPr>
+        <w:ind w:left="5760" w:hanging="360"/>
+      </w:pPr>
+    </w:lvl>
+    <w:lvl w:ilvl="8" w:tplc="0409001B" w:tentative="1">
+      <w:start w:val="1"/>
+      <w:numFmt w:val="lowerRoman"/>
+      <w:lvlText w:val="%9."/>
+      <w:lvlJc w:val="right"/>
+      <w:pPr>
+        <w:ind w:left="6480" w:hanging="180"/>
+      </w:pPr>
+    </w:lvl>
+  </w:abstractNum>
+  <w:abstractNum w:abstractNumId="2" w15:restartNumberingAfterBreak="0">
     <w:nsid w:val="1F1402DD"/>
     <w:multiLevelType w:val="multilevel"/>
     <w:tmpl w:val="1744FB8A"/>
@@ -8853,7 +8896,7 @@
       </w:rPr>
     </w:lvl>
   </w:abstractNum>
-  <w:abstractNum w:abstractNumId="2" w15:restartNumberingAfterBreak="0">
+  <w:abstractNum w:abstractNumId="3" w15:restartNumberingAfterBreak="0">
     <w:nsid w:val="284C1FA6"/>
     <w:multiLevelType w:val="hybridMultilevel"/>
     <w:tmpl w:val="ACB2CF40"/>
@@ -8966,7 +9009,7 @@
       </w:rPr>
     </w:lvl>
   </w:abstractNum>
-  <w:abstractNum w:abstractNumId="3" w15:restartNumberingAfterBreak="0">
+  <w:abstractNum w:abstractNumId="4" w15:restartNumberingAfterBreak="0">
     <w:nsid w:val="288235E0"/>
     <w:multiLevelType w:val="hybridMultilevel"/>
     <w:tmpl w:val="C25E10CA"/>
@@ -9082,7 +9125,7 @@
       </w:rPr>
     </w:lvl>
   </w:abstractNum>
-  <w:abstractNum w:abstractNumId="4" w15:restartNumberingAfterBreak="0">
+  <w:abstractNum w:abstractNumId="5" w15:restartNumberingAfterBreak="0">
     <w:nsid w:val="2BC97493"/>
     <w:multiLevelType w:val="hybridMultilevel"/>
     <w:tmpl w:val="4A120C96"/>
@@ -9171,7 +9214,96 @@
       </w:pPr>
     </w:lvl>
   </w:abstractNum>
-  <w:abstractNum w:abstractNumId="5" w15:restartNumberingAfterBreak="0">
+  <w:abstractNum w:abstractNumId="6" w15:restartNumberingAfterBreak="0">
+    <w:nsid w:val="39343086"/>
+    <w:multiLevelType w:val="hybridMultilevel"/>
+    <w:tmpl w:val="5270FDE0"/>
+    <w:lvl w:ilvl="0" w:tplc="D23CC446">
+      <w:start w:val="1"/>
+      <w:numFmt w:val="decimal"/>
+      <w:lvlText w:val="%1."/>
+      <w:lvlJc w:val="left"/>
+      <w:pPr>
+        <w:ind w:left="720" w:hanging="360"/>
+      </w:pPr>
+      <w:rPr>
+        <w:rFonts w:cstheme="minorBidi" w:hint="default"/>
+      </w:rPr>
+    </w:lvl>
+    <w:lvl w:ilvl="1" w:tplc="04090019" w:tentative="1">
+      <w:start w:val="1"/>
+      <w:numFmt w:val="lowerLetter"/>
+      <w:lvlText w:val="%2."/>
+      <w:lvlJc w:val="left"/>
+      <w:pPr>
+        <w:ind w:left="1440" w:hanging="360"/>
+      </w:pPr>
+    </w:lvl>
+    <w:lvl w:ilvl="2" w:tplc="0409001B" w:tentative="1">
+      <w:start w:val="1"/>
+      <w:numFmt w:val="lowerRoman"/>
+      <w:lvlText w:val="%3."/>
+      <w:lvlJc w:val="right"/>
+      <w:pPr>
+        <w:ind w:left="2160" w:hanging="180"/>
+      </w:pPr>
+    </w:lvl>
+    <w:lvl w:ilvl="3" w:tplc="0409000F" w:tentative="1">
+      <w:start w:val="1"/>
+      <w:numFmt w:val="decimal"/>
+      <w:lvlText w:val="%4."/>
+      <w:lvlJc w:val="left"/>
+      <w:pPr>
+        <w:ind w:left="2880" w:hanging="360"/>
+      </w:pPr>
+    </w:lvl>
+    <w:lvl w:ilvl="4" w:tplc="04090019" w:tentative="1">
+      <w:start w:val="1"/>
+      <w:numFmt w:val="lowerLetter"/>
+      <w:lvlText w:val="%5."/>
+      <w:lvlJc w:val="left"/>
+      <w:pPr>
+        <w:ind w:left="3600" w:hanging="360"/>
+      </w:pPr>
+    </w:lvl>
+    <w:lvl w:ilvl="5" w:tplc="0409001B" w:tentative="1">
+      <w:start w:val="1"/>
+      <w:numFmt w:val="lowerRoman"/>
+      <w:lvlText w:val="%6."/>
+      <w:lvlJc w:val="right"/>
+      <w:pPr>
+        <w:ind w:left="4320" w:hanging="180"/>
+      </w:pPr>
+    </w:lvl>
+    <w:lvl w:ilvl="6" w:tplc="0409000F" w:tentative="1">
+      <w:start w:val="1"/>
+      <w:numFmt w:val="decimal"/>
+      <w:lvlText w:val="%7."/>
+      <w:lvlJc w:val="left"/>
+      <w:pPr>
+        <w:ind w:left="5040" w:hanging="360"/>
+      </w:pPr>
+    </w:lvl>
+    <w:lvl w:ilvl="7" w:tplc="04090019" w:tentative="1">
+      <w:start w:val="1"/>
+      <w:numFmt w:val="lowerLetter"/>
+      <w:lvlText w:val="%8."/>
+      <w:lvlJc w:val="left"/>
+      <w:pPr>
+        <w:ind w:left="5760" w:hanging="360"/>
+      </w:pPr>
+    </w:lvl>
+    <w:lvl w:ilvl="8" w:tplc="0409001B" w:tentative="1">
+      <w:start w:val="1"/>
+      <w:numFmt w:val="lowerRoman"/>
+      <w:lvlText w:val="%9."/>
+      <w:lvlJc w:val="right"/>
+      <w:pPr>
+        <w:ind w:left="6480" w:hanging="180"/>
+      </w:pPr>
+    </w:lvl>
+  </w:abstractNum>
+  <w:abstractNum w:abstractNumId="7" w15:restartNumberingAfterBreak="0">
     <w:nsid w:val="47D04370"/>
     <w:multiLevelType w:val="hybridMultilevel"/>
     <w:tmpl w:val="8CA883FC"/>
@@ -9284,7 +9416,7 @@
       </w:rPr>
     </w:lvl>
   </w:abstractNum>
-  <w:abstractNum w:abstractNumId="6" w15:restartNumberingAfterBreak="0">
+  <w:abstractNum w:abstractNumId="8" w15:restartNumberingAfterBreak="0">
     <w:nsid w:val="5797783F"/>
     <w:multiLevelType w:val="multilevel"/>
     <w:tmpl w:val="9DE4CE40"/>
@@ -9433,7 +9565,7 @@
       </w:rPr>
     </w:lvl>
   </w:abstractNum>
-  <w:abstractNum w:abstractNumId="7" w15:restartNumberingAfterBreak="0">
+  <w:abstractNum w:abstractNumId="9" w15:restartNumberingAfterBreak="0">
     <w:nsid w:val="5EDC6E17"/>
     <w:multiLevelType w:val="hybridMultilevel"/>
     <w:tmpl w:val="3B9AEEAE"/>
@@ -9522,7 +9654,7 @@
       </w:pPr>
     </w:lvl>
   </w:abstractNum>
-  <w:abstractNum w:abstractNumId="8" w15:restartNumberingAfterBreak="0">
+  <w:abstractNum w:abstractNumId="10" w15:restartNumberingAfterBreak="0">
     <w:nsid w:val="6BBE2FD6"/>
     <w:multiLevelType w:val="multilevel"/>
     <w:tmpl w:val="DCC86088"/>
@@ -9671,7 +9803,96 @@
       </w:rPr>
     </w:lvl>
   </w:abstractNum>
-  <w:abstractNum w:abstractNumId="9" w15:restartNumberingAfterBreak="0">
+  <w:abstractNum w:abstractNumId="11" w15:restartNumberingAfterBreak="0">
+    <w:nsid w:val="6D4F4E58"/>
+    <w:multiLevelType w:val="hybridMultilevel"/>
+    <w:tmpl w:val="29F87D38"/>
+    <w:lvl w:ilvl="0" w:tplc="359E7746">
+      <w:start w:val="1"/>
+      <w:numFmt w:val="decimal"/>
+      <w:lvlText w:val="%1."/>
+      <w:lvlJc w:val="left"/>
+      <w:pPr>
+        <w:ind w:left="720" w:hanging="360"/>
+      </w:pPr>
+      <w:rPr>
+        <w:rFonts w:cstheme="minorBidi" w:hint="default"/>
+      </w:rPr>
+    </w:lvl>
+    <w:lvl w:ilvl="1" w:tplc="04090019" w:tentative="1">
+      <w:start w:val="1"/>
+      <w:numFmt w:val="lowerLetter"/>
+      <w:lvlText w:val="%2."/>
+      <w:lvlJc w:val="left"/>
+      <w:pPr>
+        <w:ind w:left="1440" w:hanging="360"/>
+      </w:pPr>
+    </w:lvl>
+    <w:lvl w:ilvl="2" w:tplc="0409001B" w:tentative="1">
+      <w:start w:val="1"/>
+      <w:numFmt w:val="lowerRoman"/>
+      <w:lvlText w:val="%3."/>
+      <w:lvlJc w:val="right"/>
+      <w:pPr>
+        <w:ind w:left="2160" w:hanging="180"/>
+      </w:pPr>
+    </w:lvl>
+    <w:lvl w:ilvl="3" w:tplc="0409000F" w:tentative="1">
+      <w:start w:val="1"/>
+      <w:numFmt w:val="decimal"/>
+      <w:lvlText w:val="%4."/>
+      <w:lvlJc w:val="left"/>
+      <w:pPr>
+        <w:ind w:left="2880" w:hanging="360"/>
+      </w:pPr>
+    </w:lvl>
+    <w:lvl w:ilvl="4" w:tplc="04090019" w:tentative="1">
+      <w:start w:val="1"/>
+      <w:numFmt w:val="lowerLetter"/>
+      <w:lvlText w:val="%5."/>
+      <w:lvlJc w:val="left"/>
+      <w:pPr>
+        <w:ind w:left="3600" w:hanging="360"/>
+      </w:pPr>
+    </w:lvl>
+    <w:lvl w:ilvl="5" w:tplc="0409001B" w:tentative="1">
+      <w:start w:val="1"/>
+      <w:numFmt w:val="lowerRoman"/>
+      <w:lvlText w:val="%6."/>
+      <w:lvlJc w:val="right"/>
+      <w:pPr>
+        <w:ind w:left="4320" w:hanging="180"/>
+      </w:pPr>
+    </w:lvl>
+    <w:lvl w:ilvl="6" w:tplc="0409000F" w:tentative="1">
+      <w:start w:val="1"/>
+      <w:numFmt w:val="decimal"/>
+      <w:lvlText w:val="%7."/>
+      <w:lvlJc w:val="left"/>
+      <w:pPr>
+        <w:ind w:left="5040" w:hanging="360"/>
+      </w:pPr>
+    </w:lvl>
+    <w:lvl w:ilvl="7" w:tplc="04090019" w:tentative="1">
+      <w:start w:val="1"/>
+      <w:numFmt w:val="lowerLetter"/>
+      <w:lvlText w:val="%8."/>
+      <w:lvlJc w:val="left"/>
+      <w:pPr>
+        <w:ind w:left="5760" w:hanging="360"/>
+      </w:pPr>
+    </w:lvl>
+    <w:lvl w:ilvl="8" w:tplc="0409001B" w:tentative="1">
+      <w:start w:val="1"/>
+      <w:numFmt w:val="lowerRoman"/>
+      <w:lvlText w:val="%9."/>
+      <w:lvlJc w:val="right"/>
+      <w:pPr>
+        <w:ind w:left="6480" w:hanging="180"/>
+      </w:pPr>
+    </w:lvl>
+  </w:abstractNum>
+  <w:abstractNum w:abstractNumId="12" w15:restartNumberingAfterBreak="0">
     <w:nsid w:val="76AF710D"/>
     <w:multiLevelType w:val="hybridMultilevel"/>
     <w:tmpl w:val="444EE492"/>
@@ -9785,34 +10006,43 @@
     </w:lvl>
   </w:abstractNum>
   <w:num w:numId="1" w16cid:durableId="127020784">
-    <w:abstractNumId w:val="7"/>
+    <w:abstractNumId w:val="9"/>
   </w:num>
   <w:num w:numId="2" w16cid:durableId="2000039172">
-    <w:abstractNumId w:val="9"/>
+    <w:abstractNumId w:val="12"/>
   </w:num>
   <w:num w:numId="3" w16cid:durableId="1936982901">
     <w:abstractNumId w:val="0"/>
   </w:num>
   <w:num w:numId="4" w16cid:durableId="622080315">
+    <w:abstractNumId w:val="10"/>
+  </w:num>
+  <w:num w:numId="5" w16cid:durableId="73937343">
+    <w:abstractNumId w:val="2"/>
+  </w:num>
+  <w:num w:numId="6" w16cid:durableId="1542934277">
     <w:abstractNumId w:val="8"/>
   </w:num>
-  <w:num w:numId="5" w16cid:durableId="73937343">
+  <w:num w:numId="7" w16cid:durableId="1324162350">
+    <w:abstractNumId w:val="7"/>
+  </w:num>
+  <w:num w:numId="8" w16cid:durableId="489561476">
+    <w:abstractNumId w:val="5"/>
+  </w:num>
+  <w:num w:numId="9" w16cid:durableId="842016656">
+    <w:abstractNumId w:val="4"/>
+  </w:num>
+  <w:num w:numId="10" w16cid:durableId="1045836290">
+    <w:abstractNumId w:val="3"/>
+  </w:num>
+  <w:num w:numId="11" w16cid:durableId="811093102">
+    <w:abstractNumId w:val="6"/>
+  </w:num>
+  <w:num w:numId="12" w16cid:durableId="2019115186">
     <w:abstractNumId w:val="1"/>
   </w:num>
-  <w:num w:numId="6" w16cid:durableId="1542934277">
-    <w:abstractNumId w:val="6"/>
-  </w:num>
-  <w:num w:numId="7" w16cid:durableId="1324162350">
-    <w:abstractNumId w:val="5"/>
-  </w:num>
-  <w:num w:numId="8" w16cid:durableId="489561476">
-    <w:abstractNumId w:val="4"/>
-  </w:num>
-  <w:num w:numId="9" w16cid:durableId="842016656">
-    <w:abstractNumId w:val="3"/>
-  </w:num>
-  <w:num w:numId="10" w16cid:durableId="1045836290">
-    <w:abstractNumId w:val="2"/>
+  <w:num w:numId="13" w16cid:durableId="267660958">
+    <w:abstractNumId w:val="11"/>
   </w:num>
 </w:numbering>
 </file>
@@ -10978,6 +11208,11 @@
       <w:szCs w:val="20"/>
     </w:rPr>
   </w:style>
+  <w:style w:type="character" w:customStyle="1" w:styleId="citation-165">
+    <w:name w:val="citation-165"/>
+    <w:basedOn w:val="DefaultParagraphFont"/>
+    <w:rsid w:val="00E50F25"/>
+  </w:style>
 </w:styles>
 </file>
 
@@ -11324,6 +11559,13 @@
     <w:pitch w:val="variable"/>
     <w:sig w:usb0="00000000" w:usb1="10000000" w:usb2="00000000" w:usb3="00000000" w:csb0="80000000" w:csb1="00000000"/>
   </w:font>
+  <w:font w:name="Arial">
+    <w:panose1 w:val="020B0604020202020204"/>
+    <w:charset w:val="00"/>
+    <w:family w:val="swiss"/>
+    <w:pitch w:val="variable"/>
+    <w:sig w:usb0="E0002EFF" w:usb1="C000785B" w:usb2="00000009" w:usb3="00000000" w:csb0="000001FF" w:csb1="00000000"/>
+  </w:font>
   <w:font w:name="Malgun Gothic">
     <w:altName w:val="맑은 고딕"/>
     <w:panose1 w:val="020B0503020000020004"/>
@@ -11331,13 +11573,6 @@
     <w:family w:val="swiss"/>
     <w:pitch w:val="variable"/>
     <w:sig w:usb0="9000002F" w:usb1="29D77CFB" w:usb2="00000012" w:usb3="00000000" w:csb0="00080001" w:csb1="00000000"/>
-  </w:font>
-  <w:font w:name="Arial">
-    <w:panose1 w:val="020B0604020202020204"/>
-    <w:charset w:val="00"/>
-    <w:family w:val="swiss"/>
-    <w:pitch w:val="variable"/>
-    <w:sig w:usb0="E0002EFF" w:usb1="C000785B" w:usb2="00000009" w:usb3="00000000" w:csb0="000001FF" w:csb1="00000000"/>
   </w:font>
   <w:font w:name="Aptos Display">
     <w:panose1 w:val="020B0004020202020204"/>
@@ -11352,14 +11587,6 @@
     <w:family w:val="swiss"/>
     <w:pitch w:val="variable"/>
     <w:sig w:usb0="E4002EFF" w:usb1="C000E47F" w:usb2="00000009" w:usb3="00000000" w:csb0="000001FF" w:csb1="00000000"/>
-  </w:font>
-  <w:font w:name="MS Gothic">
-    <w:altName w:val="ＭＳ ゴシック"/>
-    <w:panose1 w:val="020B0609070205080204"/>
-    <w:charset w:val="80"/>
-    <w:family w:val="modern"/>
-    <w:pitch w:val="fixed"/>
-    <w:sig w:usb0="E00002FF" w:usb1="6AC7FDFB" w:usb2="08000012" w:usb3="00000000" w:csb0="0002009F" w:csb1="00000000"/>
   </w:font>
 </w:fonts>
 </file>
@@ -11383,6 +11610,7 @@
     <w:rsid w:val="000630F1"/>
     <w:rsid w:val="0008268C"/>
     <w:rsid w:val="00102B3B"/>
+    <w:rsid w:val="00142BE7"/>
     <w:rsid w:val="00166C44"/>
     <w:rsid w:val="0018229F"/>
     <w:rsid w:val="002171B0"/>
@@ -11427,6 +11655,7 @@
     <w:rsid w:val="00B54C77"/>
     <w:rsid w:val="00B63A55"/>
     <w:rsid w:val="00B83E74"/>
+    <w:rsid w:val="00BD331D"/>
     <w:rsid w:val="00C42A5D"/>
     <w:rsid w:val="00C86DA8"/>
     <w:rsid w:val="00C94300"/>
@@ -12265,25 +12494,25 @@
 </file>
 
 <file path=customXml/item1.xml><?xml version="1.0" encoding="utf-8"?>
+<b:Sources xmlns:b="http://schemas.openxmlformats.org/officeDocument/2006/bibliography" xmlns="http://schemas.openxmlformats.org/officeDocument/2006/bibliography" SelectedStyle="/APASixthEditionOfficeOnline.xsl" StyleName="APA" Version="6"/>
+</file>
+
+<file path=customXml/item2.xml><?xml version="1.0" encoding="utf-8"?>
 <root>
   <CaseName>{{case_name}}</CaseName>
 </root>
 </file>
 
-<file path=customXml/item2.xml><?xml version="1.0" encoding="utf-8"?>
-<b:Sources xmlns:b="http://schemas.openxmlformats.org/officeDocument/2006/bibliography" xmlns="http://schemas.openxmlformats.org/officeDocument/2006/bibliography" SelectedStyle="/APASixthEditionOfficeOnline.xsl" StyleName="APA" Version="6"/>
-</file>
-
 <file path=customXml/itemProps1.xml><?xml version="1.0" encoding="utf-8"?>
-<ds:datastoreItem xmlns:ds="http://schemas.openxmlformats.org/officeDocument/2006/customXml" ds:itemID="{095B2524-5F54-46AF-9C4B-2D393B5607E0}">
-  <ds:schemaRefs/>
-</ds:datastoreItem>
-</file>
-
-<file path=customXml/itemProps2.xml><?xml version="1.0" encoding="utf-8"?>
 <ds:datastoreItem xmlns:ds="http://schemas.openxmlformats.org/officeDocument/2006/customXml" ds:itemID="{3C205B19-CA3E-0146-BE8B-09E636D7F3F0}">
   <ds:schemaRefs>
     <ds:schemaRef ds:uri="http://schemas.openxmlformats.org/officeDocument/2006/bibliography"/>
   </ds:schemaRefs>
 </ds:datastoreItem>
+</file>
+
+<file path=customXml/itemProps2.xml><?xml version="1.0" encoding="utf-8"?>
+<ds:datastoreItem xmlns:ds="http://schemas.openxmlformats.org/officeDocument/2006/customXml" ds:itemID="{095B2524-5F54-46AF-9C4B-2D393B5607E0}">
+  <ds:schemaRefs/>
+</ds:datastoreItem>
 </file>
</xml_diff>